<commit_message>
Redesign the dashboard in plain Turkish and apply code-review fixes
- New single-column dashboard for non-specialists: plain-language status,
  runway scene drawn from the observed visibility, hour-by-hour fog chance
  with warning thresholds, Turkey time, km/h and metres, glossary, and
  verification explained in words (technical tables kept behind details).
- SHAP values summed into ten plain-language factor groups (PLAIN_FACTORS).
- Shared live cycle (live_log.run_cycle) for the server, the static
  publisher and the CLI; refresh lock in the FastAPI server; verification
  limited to the fetched window; feature matrix built once per horizon.
- Workflow no longer overwrites the live log when the branch fetch fails.
- New test: every model feature belongs to one plain-language factor.
- Paper and decks updated with the new application figure.
</commit_message>
<xml_diff>
--- a/report/Esenboga_DusukGorus_Tahmini_IEEE_TR.docx
+++ b/report/Esenboga_DusukGorus_Tahmini_IEEE_TR.docx
@@ -3755,7 +3755,7 @@
         <w:pStyle w:val="Text"/>
       </w:pPr>
       <w:r>
-        <w:t>Operasyonel sistem bir FastAPI web uygulamasıdır (Şekil 14). Uygulama her on dakikada bir son 120 saatin METAR'larını NOAA Aviation Weather Center'dan (yedek kaynak IEM) indirir; çevrimdışı çalışmayla tamamen aynı çözme, kalite kontrolü, ızgaralama ve öznitelik kodunu çalıştırır ve 1–6 saat için kalibre edilmiş sis olasılıklarını, 1, 3 ve 6 saat için ILS kategorisi görünümünü, bir uyarı seviyesini ve öne çıkan SHAP katkılarını yayımlar. Sis gözleniyorsa veya 1–2 saatlik olasılık eşiğini aşıyorsa uyarı kırmızı, yalnızca 3–6 saatlik tahminler eşiklerini aşıyorsa turuncu, herhangi bir olasılık eşiğinin yarısını aşıyorsa sarıdır (izleme). Her tahmin kaydedilmekte ve geçerlilik zamanı geldiğinde otomatik olarak doğrulanmaktadır; böylece gerçek anlamda gerçek zamanlı bir doğrulama kaydı oluşmaktadır. Sunucu gerektirmeyen herkese açık bir kopya aynı döngüyü GitHub Actions üzerinde her 30 dakikada bir çalıştırmakta ve arayüzü https://atasakik.github.io/esenboga-fog-nowcasting/ adresinde yayımlamaktadır.</w:t>
+        <w:t>Operasyonel sistem bir FastAPI web uygulamasıdır (Şekil 14). Uygulama her on dakikada bir son 120 saatin METAR'larını NOAA Aviation Weather Center'dan (yedek kaynak IEM) indirir; çevrimdışı çalışmayla tamamen aynı çözme, kalite kontrolü, ızgaralama ve öznitelik kodunu çalıştırır ve 1–6 saat için kalibre edilmiş sis olasılıklarını, 1, 3 ve 6 saat için ILS kategorisi görünümünü, bir uyarı seviyesini ve öne çıkan SHAP katkılarını yayımlar. TreeSHAP değerleri toplanabilir olduğundan 77 katkı, uzman olmayan kullanıcıların da okuyabilmesi için ayrıca on sade etken grubunda (ör. nem, rüzgâr, günün saati) toplanmaktadır. Sis gözleniyorsa veya 1–2 saatlik olasılık eşiğini aşıyorsa uyarı kırmızı, yalnızca 3–6 saatlik tahminler eşiklerini aşıyorsa turuncu, herhangi bir olasılık eşiğinin yarısını aşıyorsa sarıdır (izleme). Her tahmin kaydedilmekte ve geçerlilik zamanı geldiğinde otomatik olarak doğrulanmaktadır; böylece gerçek anlamda gerçek zamanlı bir doğrulama kaydı oluşmaktadır. Sunucu gerektirmeyen herkese açık bir kopya aynı döngüyü GitHub Actions üzerinde her 30 dakikada bir çalıştırmakta ve arayüzü https://atasakik.github.io/esenboga-fog-nowcasting/ adresinde yayımlamaktadır.</w:t>
       </w:r>
     </w:p>
     <w:p>
@@ -17118,7 +17118,7 @@
         <w:rPr>
           <w:sz w:val="16"/>
         </w:rPr>
-        <w:t>Web tabanlı erken uyarı uygulaması: uyarı bandı, önümüzdeki 6 saat için kalibre edilmiş sis olasılıkları, anlık koşullar, ILS kategorisi görünümü ve SHAP tabanlı etkili faktörler.</w:t>
+        <w:t>Web tabanlı erken uyarı uygulaması. Solda: gözlenen görüşe göre çizilen pist sahnesi üzerinde sade dille durum özeti ve önümüzdeki 6 saatin sis olasılıkları ile uyarı eşikleri. Sağda: seçilen saatin etkili faktörleri (sade dildeki gruplara toplanmış SHAP değerleri) ve ILS kategorisi görünümü.</w:t>
       </w:r>
     </w:p>
     <w:p>

</xml_diff>